<commit_message>
docs: refresh README.docx from README.md
</commit_message>
<xml_diff>
--- a/README.docx
+++ b/README.docx
@@ -5741,21 +5741,7 @@
         <w:rPr>
           <w:sz w:val="20"/>
         </w:rPr>
-        <w:t xml:space="preserve">7. Copy the generated key — you'll paste it into </w:t>
-      </w:r>
-      <w:r>
-        <w:rPr>
-          <w:rFonts w:ascii="Consolas" w:hAnsi="Consolas"/>
-          <w:color w:val="C03030"/>
-          <w:sz w:val="18"/>
-        </w:rPr>
-        <w:t>main.cpp</w:t>
-      </w:r>
-      <w:r>
-        <w:rPr>
-          <w:sz w:val="20"/>
-        </w:rPr>
-        <w:t xml:space="preserve"> next.</w:t>
+        <w:t>7. Copy the generated key — you'll add it to local config files next.</w:t>
       </w:r>
     </w:p>
     <w:p>
@@ -5831,7 +5817,7 @@
         <w:rPr>
           <w:sz w:val="20"/>
         </w:rPr>
-        <w:t xml:space="preserve">Open </w:t>
+        <w:t xml:space="preserve">Copy </w:t>
       </w:r>
       <w:r>
         <w:rPr>
@@ -5839,13 +5825,27 @@
           <w:color w:val="C03030"/>
           <w:sz w:val="18"/>
         </w:rPr>
-        <w:t>src/main.cpp</w:t>
-      </w:r>
-      <w:r>
-        <w:rPr>
-          <w:sz w:val="20"/>
-        </w:rPr>
-        <w:t xml:space="preserve"> and edit the three credential lines near the top of the file:</w:t>
+        <w:t>src/secrets.example.h</w:t>
+      </w:r>
+      <w:r>
+        <w:rPr>
+          <w:sz w:val="20"/>
+        </w:rPr>
+        <w:t xml:space="preserve"> to </w:t>
+      </w:r>
+      <w:r>
+        <w:rPr>
+          <w:rFonts w:ascii="Consolas" w:hAnsi="Consolas"/>
+          <w:color w:val="C03030"/>
+          <w:sz w:val="18"/>
+        </w:rPr>
+        <w:t>src/secrets.h</w:t>
+      </w:r>
+      <w:r>
+        <w:rPr>
+          <w:sz w:val="20"/>
+        </w:rPr>
+        <w:t>, then edit the copied file with your WiFi and Google TTS credentials:</w:t>
       </w:r>
     </w:p>
     <w:p>
@@ -5860,11 +5860,32 @@
           <w:sz w:val="16"/>
           <w:shd w:fill="F0F0F0" w:val="clear"/>
         </w:rPr>
-        <w:t>const char *WIFI_SSID     = "YourWiFiName";       // ← your WiFi network name</w:t>
+        <w:t>// src/secrets.h</w:t>
         <w:br/>
-        <w:t>const char *WIFI_PASSWORD = "YourWiFiPassword";    // ← your WiFi password</w:t>
+        <w:t>#pragma once</w:t>
         <w:br/>
-        <w:t>const char *TTS_API_KEY   = "AIza...";             // ← your Google Cloud API key</w:t>
+        <w:br/>
+        <w:t>const char *WIFI_SSID = "YourWiFiName";</w:t>
+        <w:br/>
+        <w:t>const char *WIFI_PASSWORD = "YourWiFiPassword";</w:t>
+        <w:br/>
+        <w:t>const char *TTS_API_KEY = "AIza...";</w:t>
+      </w:r>
+    </w:p>
+    <w:p>
+      <w:r>
+        <w:rPr>
+          <w:rFonts w:ascii="Consolas" w:hAnsi="Consolas"/>
+          <w:color w:val="C03030"/>
+          <w:sz w:val="18"/>
+        </w:rPr>
+        <w:t>src/secrets.h</w:t>
+      </w:r>
+      <w:r>
+        <w:rPr>
+          <w:sz w:val="20"/>
+        </w:rPr>
+        <w:t xml:space="preserve"> is gitignored, so your real credentials stay on your machine and out of the repository.</w:t>
       </w:r>
     </w:p>
     <w:p>
@@ -5887,7 +5908,24 @@
           <w:color w:val="555555"/>
           <w:sz w:val="20"/>
         </w:rPr>
-        <w:t xml:space="preserve"> The API key is compiled into the firmware binary. Do not commit real credentials to a public repository.</w:t>
+        <w:t xml:space="preserve"> The API key is still compiled into the firmware binary. Keep the binary private, and never commit </w:t>
+      </w:r>
+      <w:r>
+        <w:rPr>
+          <w:rFonts w:ascii="Consolas" w:hAnsi="Consolas"/>
+          <w:i/>
+          <w:color w:val="555555"/>
+          <w:sz w:val="18"/>
+        </w:rPr>
+        <w:t>src/secrets.h</w:t>
+      </w:r>
+      <w:r>
+        <w:rPr>
+          <w:i/>
+          <w:color w:val="555555"/>
+          <w:sz w:val="20"/>
+        </w:rPr>
+        <w:t>.</w:t>
       </w:r>
     </w:p>
     <w:p>
@@ -6050,9 +6088,13 @@
         <w:br/>
         <w:t>├── src/</w:t>
         <w:br/>
-        <w:t>│   └── main.cpp            # Complete ESP32 firmware (~645 lines)</w:t>
+        <w:t>│   ├── main.cpp            # Complete ESP32 firmware (~645 lines)</w:t>
+        <w:br/>
+        <w:t>│   └── secrets.example.h   # Copy to secrets.h locally and add credentials</w:t>
         <w:br/>
         <w:t>└── pc_app/                 # Standalone desktop TTS tool (see below)</w:t>
+        <w:br/>
+        <w:t xml:space="preserve">  ├── local_config.example.json</w:t>
         <w:br/>
         <w:t xml:space="preserve">    ├── tts_mic.py</w:t>
         <w:br/>
@@ -6235,7 +6277,35 @@
         <w:rPr>
           <w:sz w:val="20"/>
         </w:rPr>
-        <w:t xml:space="preserve"> — use the same API key as the ESP32 (already in the code)</w:t>
+        <w:t xml:space="preserve"> — use the same API key as the ESP32, but keep it in </w:t>
+      </w:r>
+      <w:r>
+        <w:rPr>
+          <w:rFonts w:ascii="Consolas" w:hAnsi="Consolas"/>
+          <w:color w:val="C03030"/>
+          <w:sz w:val="18"/>
+        </w:rPr>
+        <w:t>pc_app/local_config.json</w:t>
+      </w:r>
+      <w:r>
+        <w:rPr>
+          <w:sz w:val="20"/>
+        </w:rPr>
+        <w:t xml:space="preserve"> or the </w:t>
+      </w:r>
+      <w:r>
+        <w:rPr>
+          <w:rFonts w:ascii="Consolas" w:hAnsi="Consolas"/>
+          <w:color w:val="C03030"/>
+          <w:sz w:val="18"/>
+        </w:rPr>
+        <w:t>GOOGLE_TTS_API_KEY</w:t>
+      </w:r>
+      <w:r>
+        <w:rPr>
+          <w:sz w:val="20"/>
+        </w:rPr>
+        <w:t xml:space="preserve"> environment variable</w:t>
       </w:r>
     </w:p>
     <w:p>
@@ -6326,6 +6396,65 @@
         <w:t>cd pc_app</w:t>
         <w:br/>
         <w:t>pip install -r requirements.txt</w:t>
+        <w:br/>
+        <w:t>copy local_config.example.json local_config.json</w:t>
+      </w:r>
+    </w:p>
+    <w:p>
+      <w:r>
+        <w:rPr>
+          <w:sz w:val="20"/>
+        </w:rPr>
+        <w:t xml:space="preserve">Then edit </w:t>
+      </w:r>
+      <w:r>
+        <w:rPr>
+          <w:rFonts w:ascii="Consolas" w:hAnsi="Consolas"/>
+          <w:color w:val="C03030"/>
+          <w:sz w:val="18"/>
+        </w:rPr>
+        <w:t>pc_app/local_config.json</w:t>
+      </w:r>
+      <w:r>
+        <w:rPr>
+          <w:sz w:val="20"/>
+        </w:rPr>
+        <w:t xml:space="preserve"> and add your Google Cloud API key:</w:t>
+      </w:r>
+    </w:p>
+    <w:p>
+      <w:pPr>
+        <w:spacing w:before="80" w:after="80"/>
+        <w:ind w:left="283"/>
+      </w:pPr>
+      <w:r>
+        <w:rPr>
+          <w:rFonts w:ascii="Consolas" w:hAnsi="Consolas"/>
+          <w:color w:val="202020"/>
+          <w:sz w:val="16"/>
+          <w:shd w:fill="F0F0F0" w:val="clear"/>
+        </w:rPr>
+        <w:t>{</w:t>
+        <w:br/>
+        <w:t xml:space="preserve">  "google_tts_api_key": "AIza..."</w:t>
+        <w:br/>
+        <w:t>}</w:t>
+      </w:r>
+    </w:p>
+    <w:p>
+      <w:r>
+        <w:rPr>
+          <w:rFonts w:ascii="Consolas" w:hAnsi="Consolas"/>
+          <w:color w:val="C03030"/>
+          <w:sz w:val="18"/>
+        </w:rPr>
+        <w:t>pc_app/local_config.json</w:t>
+      </w:r>
+      <w:r>
+        <w:rPr>
+          <w:sz w:val="20"/>
+        </w:rPr>
+        <w:t xml:space="preserve"> is gitignored, so it will not be pushed to GitHub.</w:t>
       </w:r>
     </w:p>
     <w:p>

</xml_diff>